<commit_message>
modified:   SeminarskiRadKK.docx 	deleted:    ~$minarskiRadKK.docx
</commit_message>
<xml_diff>
--- a/SeminarskiRadKK.docx
+++ b/SeminarskiRadKK.docx
@@ -1705,7 +1705,7 @@
           <w:szCs w:val="24"/>
           <w:lang w:val="sr-Latn-RS" w:eastAsia="zh-CN" w:bidi="ar"/>
         </w:rPr>
-        <w:t>13</w:t>
+        <w:t>16</w:t>
       </w:r>
     </w:p>
     <w:p>
@@ -1768,8 +1768,10 @@
           <w:szCs w:val="24"/>
           <w:lang w:val="sr-Latn-RS" w:eastAsia="zh-CN" w:bidi="ar"/>
         </w:rPr>
-        <w:t>14</w:t>
-      </w:r>
+        <w:t>17</w:t>
+      </w:r>
+      <w:bookmarkStart w:id="0" w:name="_GoBack"/>
+      <w:bookmarkEnd w:id="0"/>
     </w:p>
     <w:p>
       <w:pPr>
@@ -2825,6 +2827,7 @@
         <w:keepLines w:val="0"/>
         <w:widowControl/>
         <w:numPr>
+          <w:ilvl w:val="0"/>
           <w:numId w:val="0"/>
         </w:numPr>
         <w:suppressLineNumbers w:val="0"/>
@@ -2856,6 +2859,7 @@
         <w:keepLines w:val="0"/>
         <w:widowControl/>
         <w:numPr>
+          <w:ilvl w:val="0"/>
           <w:numId w:val="0"/>
         </w:numPr>
         <w:suppressLineNumbers w:val="0"/>
@@ -17149,8 +17153,6 @@
           <w:lang w:val="sr-Latn-RS" w:eastAsia="zh-CN" w:bidi="ar"/>
         </w:rPr>
       </w:pPr>
-      <w:bookmarkStart w:id="0" w:name="_GoBack"/>
-      <w:bookmarkEnd w:id="0"/>
     </w:p>
     <w:p>
       <w:pPr>

</xml_diff>

<commit_message>
modified:   SeminarskiRadKK.docx 	modified:   umlDiagram-Rust/examples/zad5.puml 	modified:   umlDiagram-Rust/examples/zad6.puml 	modified:   umlDiagram-Rust/generator/__pycache__/rustGenerator.cpython-311.pyc 	modified:   umlDiagram-Rust/generator/rustGenerator.py 	modified:   umlDiagram-Rust/main.py 	modified:   umlDiagram-Rust/output/Address.rs 	new file:   umlDiagram-Rust/output/Address5.rs 	modified:   umlDiagram-Rust/output/Customer.rs 	modified:   umlDiagram-Rust/output/Employee.rs 	modified:   umlDiagram-Rust/output/Person.rs 	modified:   umlDiagram-Rust/semantic/__pycache__/analyzer.cpython-311.pyc 	modified:   umlDiagram-Rust/semantic/analyzer.py 	new file:   ~$minarskiRadKK.docx
</commit_message>
<xml_diff>
--- a/SeminarskiRadKK.docx
+++ b/SeminarskiRadKK.docx
@@ -1796,8 +1796,6 @@
         </w:rPr>
         <w:t>8</w:t>
       </w:r>
-      <w:bookmarkStart w:id="0" w:name="_GoBack"/>
-      <w:bookmarkEnd w:id="0"/>
     </w:p>
     <w:p>
       <w:pPr>
@@ -2091,7 +2089,17 @@
         <w:t xml:space="preserve"> </w:t>
       </w:r>
       <w:r>
-        <w:t>Prevodioc omogućava da se grafički model softverskog sistema transformiše u odgovarajuću programsku strukturu, čime se ubrzava razvoj aplikacija i smanjuje mogućnost grešaka prilikom ručnog pisanja koda.</w:t>
+        <w:t>Prevodi</w:t>
+      </w:r>
+      <w:r>
+        <w:rPr>
+          <w:rFonts w:hint="default"/>
+          <w:lang w:val="en-GB"/>
+        </w:rPr>
+        <w:t>lac</w:t>
+      </w:r>
+      <w:r>
+        <w:t xml:space="preserve"> omogućava da se grafički model softverskog sistema transformiše u odgovarajuću programsku strukturu, čime se ubrzava razvoj aplikacija i smanjuje mogućnost grešaka prilikom ručnog pisanja koda.</w:t>
       </w:r>
     </w:p>
     <w:p>
@@ -4158,16 +4166,18 @@
           <w:rFonts w:hint="default" w:ascii="Times New Roman" w:hAnsi="Times New Roman" w:cs="Times New Roman"/>
           <w:sz w:val="24"/>
           <w:szCs w:val="24"/>
-        </w:rPr>
-      </w:pPr>
-      <w:r>
-        <w:rPr>
-          <w:rStyle w:val="7"/>
-          <w:rFonts w:hint="default" w:ascii="Times New Roman" w:hAnsi="Times New Roman" w:cs="Times New Roman"/>
-          <w:sz w:val="24"/>
-          <w:szCs w:val="24"/>
-        </w:rPr>
-        <w:t>Person</w:t>
+          <w:lang w:val="en-GB"/>
+        </w:rPr>
+      </w:pPr>
+      <w:r>
+        <w:rPr>
+          <w:rStyle w:val="7"/>
+          <w:rFonts w:hint="default" w:ascii="Times New Roman" w:hAnsi="Times New Roman" w:cs="Times New Roman"/>
+          <w:sz w:val="24"/>
+          <w:szCs w:val="24"/>
+          <w:lang w:val="en-GB"/>
+        </w:rPr>
+        <w:t>Osoba</w:t>
       </w:r>
     </w:p>
     <w:p>
@@ -4303,7 +4313,26 @@
           <w:sz w:val="24"/>
           <w:szCs w:val="24"/>
         </w:rPr>
-        <w:t>struct Person {</w:t>
+        <w:t xml:space="preserve">struct </w:t>
+      </w:r>
+      <w:r>
+        <w:rPr>
+          <w:rStyle w:val="7"/>
+          <w:rFonts w:hint="default" w:ascii="Times New Roman" w:hAnsi="Times New Roman" w:cs="Times New Roman"/>
+          <w:sz w:val="24"/>
+          <w:szCs w:val="24"/>
+          <w:lang w:val="en-GB"/>
+        </w:rPr>
+        <w:t>Osoba</w:t>
+      </w:r>
+      <w:r>
+        <w:rPr>
+          <w:rStyle w:val="7"/>
+          <w:rFonts w:hint="default" w:ascii="Times New Roman" w:hAnsi="Times New Roman" w:cs="Times New Roman"/>
+          <w:sz w:val="24"/>
+          <w:szCs w:val="24"/>
+        </w:rPr>
+        <w:t>{</w:t>
       </w:r>
     </w:p>
     <w:p>
@@ -4349,6 +4378,8 @@
         </w:rPr>
         <w:t>: String,</w:t>
       </w:r>
+      <w:bookmarkStart w:id="0" w:name="_GoBack"/>
+      <w:bookmarkEnd w:id="0"/>
     </w:p>
     <w:p>
       <w:pPr>

</xml_diff>